<commit_message>
some changes to comments
</commit_message>
<xml_diff>
--- a/documentation/PROGRAMMER_DOCUMENTATION.docx
+++ b/documentation/PROGRAMMER_DOCUMENTATION.docx
@@ -1459,7 +1459,6 @@
       <w:pPr>
         <w:bidi/>
         <w:rPr>
-          <w:rFonts w:hint="cs"/>
           <w:rtl/>
           <w:lang w:bidi="he-IL"/>
         </w:rPr>
@@ -1738,7 +1737,6 @@
       <w:pPr>
         <w:bidi/>
         <w:rPr>
-          <w:rtl/>
           <w:lang w:bidi="he-IL"/>
         </w:rPr>
       </w:pPr>
@@ -1751,12 +1749,35 @@
     </w:p>
     <w:p>
       <w:pPr>
+        <w:pStyle w:val="Heading2"/>
         <w:bidi/>
         <w:rPr>
-          <w:rtl/>
-          <w:lang w:bidi="he-IL"/>
-        </w:rPr>
-      </w:pPr>
+          <w:lang w:bidi="he-IL"/>
+        </w:rPr>
+      </w:pPr>
+      <w:r>
+        <w:rPr>
+          <w:rFonts w:ascii="Arial" w:hAnsi="Arial" w:hint="cs"/>
+          <w:rtl/>
+          <w:lang w:bidi="he-IL"/>
+        </w:rPr>
+        <w:t>6</w:t>
+      </w:r>
+      <w:r>
+        <w:rPr>
+          <w:rFonts w:ascii="Arial" w:hAnsi="Arial"/>
+          <w:rtl/>
+        </w:rPr>
+        <w:t xml:space="preserve">. יצירת קובצי </w:t>
+      </w:r>
+      <w:r>
+        <w:rPr>
+          <w:rFonts w:ascii="Arial" w:hAnsi="Arial" w:hint="cs"/>
+          <w:rtl/>
+          <w:lang w:bidi="he-IL"/>
+        </w:rPr>
+        <w:t>הספקטוגרמה</w:t>
+      </w:r>
     </w:p>
     <w:p>
       <w:pPr>
@@ -1766,6 +1787,142 @@
           <w:lang w:bidi="he-IL"/>
         </w:rPr>
       </w:pPr>
+      <w:r>
+        <w:rPr>
+          <w:rtl/>
+        </w:rPr>
+        <w:t>py</w:t>
+      </w:r>
+      <w:r>
+        <w:t>create_spectogram.</w:t>
+      </w:r>
+      <w:r>
+        <w:rPr>
+          <w:rtl/>
+        </w:rPr>
+        <w:t xml:space="preserve"> יוצר את קובצי </w:t>
+      </w:r>
+      <w:r>
+        <w:rPr>
+          <w:rFonts w:hint="cs"/>
+          <w:rtl/>
+          <w:lang w:bidi="he-IL"/>
+        </w:rPr>
+        <w:t>תיקיות הספקטוגרמה</w:t>
+      </w:r>
+      <w:r>
+        <w:rPr>
+          <w:rtl/>
+        </w:rPr>
+        <w:t>.</w:t>
+      </w:r>
+      <w:r>
+        <w:rPr>
+          <w:rFonts w:hint="cs"/>
+          <w:rtl/>
+          <w:lang w:bidi="he-IL"/>
+        </w:rPr>
+        <w:t xml:space="preserve"> </w:t>
+      </w:r>
+      <w:r>
+        <w:rPr>
+          <w:rtl/>
+          <w:lang w:bidi="he-IL"/>
+        </w:rPr>
+        <w:t xml:space="preserve">הקובץ </w:t>
+      </w:r>
+      <w:r>
+        <w:rPr>
+          <w:rFonts w:hint="cs"/>
+          <w:rtl/>
+          <w:lang w:bidi="he-IL"/>
+        </w:rPr>
+        <w:t>בונה לכל מאגר (</w:t>
+      </w:r>
+      <w:r>
+        <w:rPr>
+          <w:rtl/>
+          <w:lang w:bidi="he-IL"/>
+        </w:rPr>
+        <w:t xml:space="preserve">שנבחר באמצעות </w:t>
+      </w:r>
+      <w:r>
+        <w:rPr>
+          <w:lang w:bidi="he-IL"/>
+        </w:rPr>
+        <w:t>RUN_MODE</w:t>
+      </w:r>
+      <w:r>
+        <w:rPr>
+          <w:rFonts w:hint="cs"/>
+          <w:rtl/>
+          <w:lang w:bidi="he-IL"/>
+        </w:rPr>
+        <w:t>) את הספקטוגרמות של קבצי האודיו שנבחרו במטא-דאטה שלו .</w:t>
+      </w:r>
+      <w:r>
+        <w:rPr>
+          <w:rFonts w:hint="cs"/>
+          <w:rtl/>
+          <w:lang w:bidi="he-IL"/>
+        </w:rPr>
+        <w:t xml:space="preserve"> </w:t>
+      </w:r>
+      <w:r>
+        <w:rPr>
+          <w:rFonts w:hint="cs"/>
+          <w:rtl/>
+          <w:lang w:bidi="he-IL"/>
+        </w:rPr>
+        <w:t>אופן</w:t>
+      </w:r>
+      <w:r>
+        <w:rPr>
+          <w:rtl/>
+          <w:lang w:bidi="he-IL"/>
+        </w:rPr>
+        <w:t xml:space="preserve"> יצירת הספקטרוגרמות </w:t>
+      </w:r>
+      <w:r>
+        <w:rPr>
+          <w:rFonts w:hint="cs"/>
+          <w:rtl/>
+          <w:lang w:bidi="he-IL"/>
+        </w:rPr>
+        <w:t xml:space="preserve">בקוד מפורט בסעיף מבני </w:t>
+      </w:r>
+      <w:r>
+        <w:rPr>
+          <w:rFonts w:hint="cs"/>
+          <w:rtl/>
+          <w:lang w:bidi="he-IL"/>
+        </w:rPr>
+        <w:t>ה</w:t>
+      </w:r>
+      <w:r>
+        <w:rPr>
+          <w:rFonts w:hint="cs"/>
+          <w:rtl/>
+          <w:lang w:bidi="he-IL"/>
+        </w:rPr>
+        <w:t>נתונים</w:t>
+      </w:r>
+      <w:r>
+        <w:rPr>
+          <w:rFonts w:hint="cs"/>
+          <w:rtl/>
+          <w:lang w:bidi="he-IL"/>
+        </w:rPr>
+        <w:t xml:space="preserve"> בפרויקט</w:t>
+      </w:r>
+      <w:r>
+        <w:rPr>
+          <w:rFonts w:hint="cs"/>
+          <w:rtl/>
+          <w:lang w:bidi="he-IL"/>
+        </w:rPr>
+        <w:t>.</w:t>
+      </w:r>
     </w:p>
     <w:p>
       <w:pPr>
@@ -1775,15 +1932,66 @@
           <w:lang w:bidi="he-IL"/>
         </w:rPr>
       </w:pPr>
-    </w:p>
-    <w:p>
-      <w:pPr>
-        <w:bidi/>
-        <w:rPr>
-          <w:rtl/>
-          <w:lang w:bidi="he-IL"/>
-        </w:rPr>
-      </w:pPr>
+      <w:r>
+        <w:rPr>
+          <w:rFonts w:hint="cs"/>
+          <w:rtl/>
+          <w:lang w:bidi="he-IL"/>
+        </w:rPr>
+        <w:t>בסיום התהליך</w:t>
+      </w:r>
+      <w:r>
+        <w:rPr>
+          <w:rFonts w:hint="cs"/>
+          <w:rtl/>
+          <w:lang w:bidi="he-IL"/>
+        </w:rPr>
+        <w:t xml:space="preserve"> </w:t>
+      </w:r>
+      <w:r>
+        <w:rPr>
+          <w:rFonts w:hint="cs"/>
+          <w:rtl/>
+          <w:lang w:bidi="he-IL"/>
+        </w:rPr>
+        <w:t>נוצרת</w:t>
+      </w:r>
+      <w:r>
+        <w:rPr>
+          <w:rtl/>
+        </w:rPr>
+        <w:t xml:space="preserve"> </w:t>
+      </w:r>
+      <w:r>
+        <w:rPr>
+          <w:rFonts w:hint="cs"/>
+          <w:rtl/>
+          <w:lang w:bidi="he-IL"/>
+        </w:rPr>
+        <w:t xml:space="preserve">תיקיות ספקטוגרמה בשם </w:t>
+      </w:r>
+      <w:r>
+        <w:rPr>
+          <w:rFonts w:ascii="Courier New" w:hAnsi="Courier New"/>
+          <w:sz w:val="19"/>
+        </w:rPr>
+        <w:t>spectograms_logmel_&lt;mode&gt;/</w:t>
+      </w:r>
+      <w:r>
+        <w:rPr>
+          <w:rFonts w:hint="cs"/>
+          <w:rtl/>
+          <w:lang w:bidi="he-IL"/>
+        </w:rPr>
+        <w:t xml:space="preserve"> בהתאם למאגר בו בחרנו.</w:t>
+      </w:r>
+      <w:r>
+        <w:rPr>
+          <w:rtl/>
+          <w:lang w:bidi="he-IL"/>
+        </w:rPr>
+        <w:br/>
+      </w:r>
     </w:p>
     <w:p>
       <w:pPr>
@@ -2738,7 +2946,21 @@
         <w:rPr>
           <w:rtl/>
         </w:rPr>
-        <w:t>לאחר מכן מתבצע preprocessing של הטבלה: הסרת עמודות שאינן פיצ'רים, טיפול בערכים חסרים ונרמול.</w:t>
+        <w:t>לאחר מכן מתבצע preprocessing של הטבלה: הסרת עמודות שאינן פיצ'רים, טיפול בערכים חסרים ונרמול</w:t>
+      </w:r>
+      <w:r>
+        <w:rPr>
+          <w:rFonts w:hint="cs"/>
+          <w:rtl/>
+          <w:lang w:bidi="he-IL"/>
+        </w:rPr>
+        <w:t xml:space="preserve"> פיצ'רים</w:t>
+      </w:r>
+      <w:r>
+        <w:rPr>
+          <w:rtl/>
+        </w:rPr>
+        <w:t>.</w:t>
       </w:r>
     </w:p>
     <w:p>
@@ -2833,7 +3055,6 @@
         <w:pStyle w:val="Heading2"/>
         <w:bidi/>
         <w:rPr>
-          <w:rFonts w:hint="cs"/>
           <w:rtl/>
           <w:lang w:bidi="he-IL"/>
         </w:rPr>
@@ -3241,7 +3462,6 @@
         <w:bidi/>
         <w:ind w:left="360"/>
         <w:rPr>
-          <w:rFonts w:hint="cs"/>
           <w:lang w:bidi="he-IL"/>
         </w:rPr>
       </w:pPr>
@@ -3783,13 +4003,14 @@
           <w:lang w:bidi="he-IL"/>
         </w:rPr>
       </w:pPr>
-      <w:r>
-        <w:rPr>
-          <w:rFonts w:ascii="Courier New" w:hAnsi="Courier New"/>
-          <w:sz w:val="19"/>
-        </w:rPr>
-        <w:t>[להוסיף קישור]</w:t>
-      </w:r>
+      <w:hyperlink r:id="rId9" w:history="1">
+        <w:r>
+          <w:rPr>
+            <w:rStyle w:val="Hyperlink"/>
+          </w:rPr>
+          <w:t>https://www.kaggle.com/code/alonlev001/archive-cnn</w:t>
+        </w:r>
+      </w:hyperlink>
     </w:p>
     <w:p>
       <w:pPr>
@@ -4523,7 +4744,6 @@
             <w:pPr>
               <w:bidi/>
               <w:rPr>
-                <w:rFonts w:hint="cs"/>
                 <w:lang w:bidi="he-IL"/>
               </w:rPr>
             </w:pPr>
@@ -4574,7 +4794,6 @@
       <w:pPr>
         <w:bidi/>
         <w:rPr>
-          <w:rFonts w:hint="cs"/>
           <w:lang w:bidi="he-IL"/>
         </w:rPr>
       </w:pPr>
@@ -4833,6 +5052,8 @@
       <w:pPr>
         <w:bidi/>
         <w:rPr>
+          <w:rFonts w:hint="cs"/>
+          <w:rtl/>
           <w:lang w:bidi="he-IL"/>
         </w:rPr>
       </w:pPr>
@@ -5212,80 +5433,111 @@
     </w:p>
     <w:p>
       <w:pPr>
-        <w:bidi/>
-        <w:rPr>
-          <w:rtl/>
-          <w:lang w:bidi="he-IL"/>
-        </w:rPr>
-      </w:pPr>
+        <w:pStyle w:val="Heading2"/>
+        <w:jc w:val="right"/>
+      </w:pPr>
+      <w:r>
+        <w:rPr>
+          <w:rFonts w:hint="cs"/>
+          <w:rtl/>
+          <w:lang w:bidi="he-IL"/>
+        </w:rPr>
+        <w:t>4</w:t>
+      </w:r>
+      <w:r>
+        <w:rPr>
+          <w:rtl/>
+        </w:rPr>
+        <w:t xml:space="preserve">. </w:t>
+      </w:r>
+      <w:r>
+        <w:rPr>
+          <w:rtl/>
+        </w:rPr>
+        <w:t xml:space="preserve">וקטור פונטי </w:t>
+      </w:r>
     </w:p>
     <w:p>
       <w:pPr>
-        <w:pStyle w:val="Heading2"/>
-        <w:jc w:val="right"/>
-      </w:pPr>
+        <w:bidi/>
+        <w:rPr>
+          <w:rtl/>
+          <w:lang w:bidi="he-IL"/>
+        </w:rPr>
+      </w:pPr>
+      <w:r>
+        <w:rPr>
+          <w:rtl/>
+          <w:lang w:bidi="he-IL"/>
+        </w:rPr>
+        <w:t>וקטור של 5 מספרים המייצגים את שכיחות צלילי ה</w:t>
+      </w:r>
+      <w:r>
+        <w:rPr>
+          <w:lang w:bidi="he-IL"/>
+        </w:rPr>
+        <w:t xml:space="preserve">-IPA </w:t>
+      </w:r>
+      <w:r>
+        <w:rPr>
+          <w:rtl/>
+          <w:lang w:bidi="he-IL"/>
+        </w:rPr>
+        <w:t>בדיבור (כגון עיצורים קוליים, פיצוציים, תנועות ארוכות וכו'). ברשת ה</w:t>
+      </w:r>
+      <w:r>
+        <w:rPr>
+          <w:lang w:bidi="he-IL"/>
+        </w:rPr>
+        <w:t xml:space="preserve">-CNN </w:t>
+      </w:r>
+      <w:r>
+        <w:rPr>
+          <w:rtl/>
+          <w:lang w:bidi="he-IL"/>
+        </w:rPr>
+        <w:t xml:space="preserve">המולטי-מודאלית, הווקטור מוזרק במקביל לספקטרוגרמה, </w:t>
+      </w:r>
       <w:r>
         <w:rPr>
           <w:rFonts w:hint="cs"/>
           <w:rtl/>
           <w:lang w:bidi="he-IL"/>
         </w:rPr>
-        <w:t>4</w:t>
-      </w:r>
-      <w:r>
-        <w:rPr>
-          <w:rtl/>
-        </w:rPr>
-        <w:t xml:space="preserve">. </w:t>
-      </w:r>
-      <w:r>
-        <w:rPr>
-          <w:rtl/>
-        </w:rPr>
-        <w:t xml:space="preserve">וקטור פונטי </w:t>
-      </w:r>
-    </w:p>
-    <w:p>
-      <w:pPr>
-        <w:bidi/>
+        <w:t>משולב</w:t>
+      </w:r>
+      <w:r>
+        <w:rPr>
+          <w:rtl/>
+          <w:lang w:bidi="he-IL"/>
+        </w:rPr>
+        <w:t xml:space="preserve"> עם הייצוג האקוסטי של הרשת דרך מנגנון</w:t>
+      </w:r>
+      <w:r>
         <w:rPr>
           <w:rFonts w:hint="cs"/>
           <w:rtl/>
           <w:lang w:bidi="he-IL"/>
         </w:rPr>
-      </w:pPr>
-      <w:r>
-        <w:rPr>
-          <w:rtl/>
-          <w:lang w:bidi="he-IL"/>
-        </w:rPr>
-        <w:t>וקטור של 5 מספרים המייצגים את שכיחות צלילי ה</w:t>
-      </w:r>
-      <w:r>
-        <w:rPr>
-          <w:lang w:bidi="he-IL"/>
-        </w:rPr>
-        <w:t xml:space="preserve">-IPA </w:t>
-      </w:r>
-      <w:r>
-        <w:rPr>
-          <w:rtl/>
-          <w:lang w:bidi="he-IL"/>
-        </w:rPr>
-        <w:t>בדיבור (כגון עיצורים קוליים, פיצוציים, תנועות ארוכות וכו'). ברשת ה</w:t>
-      </w:r>
-      <w:r>
-        <w:rPr>
-          <w:lang w:bidi="he-IL"/>
-        </w:rPr>
-        <w:t xml:space="preserve">-CNN </w:t>
-      </w:r>
-      <w:r>
-        <w:rPr>
-          <w:rtl/>
-          <w:lang w:bidi="he-IL"/>
-        </w:rPr>
-        <w:t xml:space="preserve">המולטי-מודאלית, הווקטור מוזרק במקביל לספקטרוגרמה, </w:t>
+        <w:t xml:space="preserve"> </w:t>
+      </w:r>
+      <w:r>
+        <w:rPr>
+          <w:lang w:bidi="he-IL"/>
+        </w:rPr>
+        <w:t>Gated Residual Fusio</w:t>
+      </w:r>
+      <w:r>
+        <w:rPr>
+          <w:lang w:bidi="he-IL"/>
+        </w:rPr>
+        <w:t>n</w:t>
+      </w:r>
+      <w:r>
+        <w:rPr>
+          <w:lang w:bidi="he-IL"/>
+        </w:rPr>
+        <w:t xml:space="preserve"> </w:t>
       </w:r>
       <w:r>
         <w:rPr>
@@ -5293,14 +5545,26 @@
           <w:rtl/>
           <w:lang w:bidi="he-IL"/>
         </w:rPr>
-        <w:t>משולב</w:t>
-      </w:r>
-      <w:r>
-        <w:rPr>
-          <w:rtl/>
-          <w:lang w:bidi="he-IL"/>
-        </w:rPr>
-        <w:t xml:space="preserve"> עם הייצוג האקוסטי של הרשת דרך מנגנון</w:t>
+        <w:t xml:space="preserve"> </w:t>
+      </w:r>
+      <w:r>
+        <w:rPr>
+          <w:rtl/>
+          <w:lang w:bidi="he-IL"/>
+        </w:rPr>
+        <w:t>המבוסס על פונקציית האקטיבציה</w:t>
+      </w:r>
+      <w:r>
+        <w:rPr>
+          <w:lang w:bidi="he-IL"/>
+        </w:rPr>
+        <w:t xml:space="preserve"> Sigmoid</w:t>
+      </w:r>
+      <w:r>
+        <w:rPr>
+          <w:lang w:bidi="he-IL"/>
+        </w:rPr>
+        <w:t xml:space="preserve"> </w:t>
       </w:r>
       <w:r>
         <w:rPr>
@@ -5308,25 +5572,42 @@
           <w:rtl/>
           <w:lang w:bidi="he-IL"/>
         </w:rPr>
+        <w:t>.</w:t>
+      </w:r>
+      <w:r>
+        <w:rPr>
+          <w:rtl/>
+          <w:lang w:bidi="he-IL"/>
+        </w:rPr>
+        <w:br/>
+      </w:r>
+      <w:r>
+        <w:rPr>
+          <w:rtl/>
+          <w:lang w:bidi="he-IL"/>
+        </w:rPr>
+        <w:t>במודל ה־</w:t>
+      </w:r>
+      <w:r>
+        <w:rPr>
+          <w:lang w:bidi="he-IL"/>
+        </w:rPr>
+        <w:t xml:space="preserve">CNN </w:t>
+      </w:r>
+      <w:r>
+        <w:rPr>
+          <w:rFonts w:hint="cs"/>
+          <w:rtl/>
+          <w:lang w:bidi="he-IL"/>
+        </w:rPr>
         <w:t xml:space="preserve"> </w:t>
       </w:r>
       <w:r>
         <w:rPr>
-          <w:lang w:bidi="he-IL"/>
-        </w:rPr>
-        <w:t>Gated Residual Fusio</w:t>
-      </w:r>
-      <w:r>
-        <w:rPr>
-          <w:lang w:bidi="he-IL"/>
-        </w:rPr>
-        <w:t>n</w:t>
-      </w:r>
-      <w:r>
-        <w:rPr>
-          <w:lang w:bidi="he-IL"/>
-        </w:rPr>
-        <w:t xml:space="preserve"> </w:t>
+          <w:rtl/>
+          <w:lang w:bidi="he-IL"/>
+        </w:rPr>
+        <w:t xml:space="preserve">הדו־ענפי, הווקטור הפונטי משולב עם המידע מהספקטרוגרמה. </w:t>
       </w:r>
       <w:r>
         <w:rPr>
@@ -5334,26 +5615,14 @@
           <w:rtl/>
           <w:lang w:bidi="he-IL"/>
         </w:rPr>
-        <w:t xml:space="preserve"> </w:t>
-      </w:r>
-      <w:r>
-        <w:rPr>
-          <w:rtl/>
-          <w:lang w:bidi="he-IL"/>
-        </w:rPr>
-        <w:t>המבוסס על פונקציית האקטיבציה</w:t>
-      </w:r>
-      <w:r>
-        <w:rPr>
-          <w:lang w:bidi="he-IL"/>
-        </w:rPr>
-        <w:t xml:space="preserve"> Sigmoid</w:t>
-      </w:r>
-      <w:r>
-        <w:rPr>
-          <w:lang w:bidi="he-IL"/>
-        </w:rPr>
-        <w:t xml:space="preserve"> </w:t>
+        <w:t>בשל מגבלות חישוב,</w:t>
+      </w:r>
+      <w:r>
+        <w:rPr>
+          <w:rtl/>
+          <w:lang w:bidi="he-IL"/>
+        </w:rPr>
+        <w:t xml:space="preserve"> הווקטור אינו שומר את סדר הפונמות </w:t>
       </w:r>
       <w:r>
         <w:rPr>
@@ -5361,26 +5630,74 @@
           <w:rtl/>
           <w:lang w:bidi="he-IL"/>
         </w:rPr>
+        <w:t>לפ</w:t>
+      </w:r>
+      <w:r>
+        <w:rPr>
+          <w:rFonts w:hint="cs"/>
+          <w:rtl/>
+          <w:lang w:bidi="he-IL"/>
+        </w:rPr>
+        <w:t>י</w:t>
+      </w:r>
+      <w:r>
+        <w:rPr>
+          <w:rtl/>
+          <w:lang w:bidi="he-IL"/>
+        </w:rPr>
+        <w:t xml:space="preserve"> מיקומן בזמן, ולכן אינו מאפשר התאמה ישירה בינן לבין אזורי הספקטרוגרמה. </w:t>
+      </w:r>
+      <w:r>
+        <w:rPr>
+          <w:rFonts w:hint="cs"/>
+          <w:rtl/>
+          <w:lang w:bidi="he-IL"/>
+        </w:rPr>
+        <w:t xml:space="preserve">עם זאת </w:t>
+      </w:r>
+      <w:r>
+        <w:rPr>
+          <w:rtl/>
+          <w:lang w:bidi="he-IL"/>
+        </w:rPr>
+        <w:t xml:space="preserve">מאחר שמדובר בקטעי דיבור קצרים של עד ארבע שניות, הוא עשוי </w:t>
+      </w:r>
+      <w:r>
+        <w:rPr>
+          <w:rFonts w:hint="cs"/>
+          <w:rtl/>
+          <w:lang w:bidi="he-IL"/>
+        </w:rPr>
+        <w:t>לתרום מידע</w:t>
+      </w:r>
+      <w:r>
+        <w:rPr>
+          <w:rtl/>
+          <w:lang w:bidi="he-IL"/>
+        </w:rPr>
+        <w:t xml:space="preserve"> פונטי שימושי</w:t>
+      </w:r>
+      <w:r>
+        <w:rPr>
+          <w:rFonts w:hint="cs"/>
+          <w:rtl/>
+          <w:lang w:bidi="he-IL"/>
+        </w:rPr>
+        <w:t xml:space="preserve"> בתהליך הסיווג</w:t>
+      </w:r>
+      <w:r>
+        <w:rPr>
+          <w:rtl/>
+          <w:lang w:bidi="he-IL"/>
+        </w:rPr>
+        <w:t>, ללא צורך בהתאמה מדויקת של כל פונמה</w:t>
+      </w:r>
+      <w:r>
+        <w:rPr>
+          <w:lang w:bidi="he-IL"/>
+        </w:rPr>
         <w:t>.</w:t>
       </w:r>
-    </w:p>
-    <w:p>
-      <w:pPr>
-        <w:bidi/>
-        <w:rPr>
-          <w:lang w:bidi="he-IL"/>
-        </w:rPr>
-      </w:pPr>
-    </w:p>
-    <w:p>
-      <w:pPr>
-        <w:bidi/>
-        <w:rPr>
-          <w:rFonts w:hint="cs"/>
-          <w:rtl/>
-          <w:lang w:bidi="he-IL"/>
-        </w:rPr>
-      </w:pPr>
     </w:p>
     <w:p>
       <w:pPr>
@@ -5401,6 +5718,7 @@
           <w:szCs w:val="32"/>
           <w:rtl/>
         </w:rPr>
+        <w:lastRenderedPageBreak/>
         <w:t>קלט ופלט</w:t>
       </w:r>
       <w:r>
@@ -5635,15 +5953,7 @@
           <w:rtl/>
           <w:lang w:bidi="he-IL"/>
         </w:rPr>
-        <w:t xml:space="preserve">אודיו </w:t>
-      </w:r>
-      <w:r>
-        <w:rPr>
-          <w:rFonts w:hint="cs"/>
-          <w:rtl/>
-          <w:lang w:bidi="he-IL"/>
-        </w:rPr>
-        <w:t>ב</w:t>
+        <w:t>אודיו ב</w:t>
       </w:r>
       <w:r>
         <w:rPr>
@@ -5778,7 +6088,6 @@
       <w:pPr>
         <w:bidi/>
         <w:rPr>
-          <w:rFonts w:hint="cs"/>
           <w:rtl/>
           <w:lang w:bidi="he-IL"/>
         </w:rPr>
@@ -5874,7 +6183,7 @@
                     <pic:cNvPicPr/>
                   </pic:nvPicPr>
                   <pic:blipFill>
-                    <a:blip r:embed="rId9"/>
+                    <a:blip r:embed="rId10"/>
                     <a:stretch>
                       <a:fillRect/>
                     </a:stretch>
@@ -6893,7 +7202,7 @@
   <w:style w:type="paragraph" w:default="1" w:styleId="Normal">
     <w:name w:val="Normal"/>
     <w:qFormat/>
-    <w:rsid w:val="006175CA"/>
+    <w:rsid w:val="002023C5"/>
     <w:rPr>
       <w:rFonts w:ascii="Arial" w:hAnsi="Arial"/>
     </w:rPr>

</xml_diff>